<commit_message>
added encoding process code
</commit_message>
<xml_diff>
--- a/Day23/liste des exemples de preprocessing.docx
+++ b/Day23/liste des exemples de preprocessing.docx
@@ -118,16 +118,18 @@
           <w:kern w:val="0"/>
           <w:sz w:val="24"/>
           <w:szCs w:val="24"/>
-          <w:lang w:eastAsia="fr-FR"/>
-          <w14:ligatures w14:val="none"/>
-        </w:rPr>
-      </w:pPr>
-      <w:r>
-        <w:rPr>
-          <w:rFonts w:ascii="Times New Roman" w:eastAsia="Times New Roman" w:hAnsi="Times New Roman" w:cs="Times New Roman"/>
-          <w:kern w:val="0"/>
-          <w:sz w:val="24"/>
-          <w:szCs w:val="24"/>
+          <w:highlight w:val="green"/>
+          <w:lang w:eastAsia="fr-FR"/>
+          <w14:ligatures w14:val="none"/>
+        </w:rPr>
+      </w:pPr>
+      <w:r>
+        <w:rPr>
+          <w:rFonts w:ascii="Times New Roman" w:eastAsia="Times New Roman" w:hAnsi="Times New Roman" w:cs="Times New Roman"/>
+          <w:kern w:val="0"/>
+          <w:sz w:val="24"/>
+          <w:szCs w:val="24"/>
+          <w:highlight w:val="green"/>
           <w:lang w:eastAsia="fr-FR"/>
           <w14:ligatures w14:val="none"/>
         </w:rPr>
@@ -146,16 +148,18 @@
           <w:kern w:val="0"/>
           <w:sz w:val="24"/>
           <w:szCs w:val="24"/>
-          <w:lang w:eastAsia="fr-FR"/>
-          <w14:ligatures w14:val="none"/>
-        </w:rPr>
-      </w:pPr>
-      <w:r>
-        <w:rPr>
-          <w:rFonts w:ascii="Times New Roman" w:eastAsia="Times New Roman" w:hAnsi="Times New Roman" w:cs="Times New Roman"/>
-          <w:kern w:val="0"/>
-          <w:sz w:val="24"/>
-          <w:szCs w:val="24"/>
+          <w:highlight w:val="green"/>
+          <w:lang w:eastAsia="fr-FR"/>
+          <w14:ligatures w14:val="none"/>
+        </w:rPr>
+      </w:pPr>
+      <w:r>
+        <w:rPr>
+          <w:rFonts w:ascii="Times New Roman" w:eastAsia="Times New Roman" w:hAnsi="Times New Roman" w:cs="Times New Roman"/>
+          <w:kern w:val="0"/>
+          <w:sz w:val="24"/>
+          <w:szCs w:val="24"/>
+          <w:highlight w:val="green"/>
           <w:lang w:eastAsia="fr-FR"/>
           <w14:ligatures w14:val="none"/>
         </w:rPr>
@@ -174,6 +178,7 @@
           <w:kern w:val="0"/>
           <w:sz w:val="24"/>
           <w:szCs w:val="24"/>
+          <w:highlight w:val="yellow"/>
           <w:lang w:eastAsia="fr-FR"/>
           <w14:ligatures w14:val="none"/>
         </w:rPr>
@@ -186,6 +191,7 @@
           <w:kern w:val="0"/>
           <w:sz w:val="24"/>
           <w:szCs w:val="24"/>
+          <w:highlight w:val="yellow"/>
           <w:lang w:eastAsia="fr-FR"/>
           <w14:ligatures w14:val="none"/>
         </w:rPr>
@@ -204,16 +210,18 @@
           <w:kern w:val="0"/>
           <w:sz w:val="24"/>
           <w:szCs w:val="24"/>
-          <w:lang w:eastAsia="fr-FR"/>
-          <w14:ligatures w14:val="none"/>
-        </w:rPr>
-      </w:pPr>
-      <w:r>
-        <w:rPr>
-          <w:rFonts w:ascii="Times New Roman" w:eastAsia="Times New Roman" w:hAnsi="Times New Roman" w:cs="Times New Roman"/>
-          <w:kern w:val="0"/>
-          <w:sz w:val="24"/>
-          <w:szCs w:val="24"/>
+          <w:highlight w:val="green"/>
+          <w:lang w:eastAsia="fr-FR"/>
+          <w14:ligatures w14:val="none"/>
+        </w:rPr>
+      </w:pPr>
+      <w:r>
+        <w:rPr>
+          <w:rFonts w:ascii="Times New Roman" w:eastAsia="Times New Roman" w:hAnsi="Times New Roman" w:cs="Times New Roman"/>
+          <w:kern w:val="0"/>
+          <w:sz w:val="24"/>
+          <w:szCs w:val="24"/>
+          <w:highlight w:val="green"/>
           <w:lang w:eastAsia="fr-FR"/>
           <w14:ligatures w14:val="none"/>
         </w:rPr>
@@ -226,6 +234,7 @@
           <w:kern w:val="0"/>
           <w:sz w:val="24"/>
           <w:szCs w:val="24"/>
+          <w:highlight w:val="green"/>
           <w:lang w:eastAsia="fr-FR"/>
           <w14:ligatures w14:val="none"/>
         </w:rPr>
@@ -238,6 +247,7 @@
           <w:kern w:val="0"/>
           <w:sz w:val="24"/>
           <w:szCs w:val="24"/>
+          <w:highlight w:val="green"/>
           <w:lang w:eastAsia="fr-FR"/>
           <w14:ligatures w14:val="none"/>
         </w:rPr>
@@ -256,6 +266,7 @@
           <w:kern w:val="0"/>
           <w:sz w:val="24"/>
           <w:szCs w:val="24"/>
+          <w:highlight w:val="green"/>
           <w:lang w:eastAsia="fr-FR"/>
           <w14:ligatures w14:val="none"/>
         </w:rPr>
@@ -267,6 +278,7 @@
           <w:kern w:val="0"/>
           <w:sz w:val="24"/>
           <w:szCs w:val="24"/>
+          <w:highlight w:val="green"/>
           <w:lang w:eastAsia="fr-FR"/>
           <w14:ligatures w14:val="none"/>
         </w:rPr>
@@ -279,6 +291,7 @@
           <w:kern w:val="0"/>
           <w:sz w:val="24"/>
           <w:szCs w:val="24"/>
+          <w:highlight w:val="green"/>
           <w:lang w:eastAsia="fr-FR"/>
           <w14:ligatures w14:val="none"/>
         </w:rPr>
@@ -291,6 +304,7 @@
           <w:kern w:val="0"/>
           <w:sz w:val="24"/>
           <w:szCs w:val="24"/>
+          <w:highlight w:val="green"/>
           <w:lang w:eastAsia="fr-FR"/>
           <w14:ligatures w14:val="none"/>
         </w:rPr>
@@ -303,11 +317,56 @@
           <w:kern w:val="0"/>
           <w:sz w:val="24"/>
           <w:szCs w:val="24"/>
+          <w:highlight w:val="green"/>
           <w:lang w:eastAsia="fr-FR"/>
           <w14:ligatures w14:val="none"/>
         </w:rPr>
         <w:t xml:space="preserve"> (colonnes binaires 0/1 pour chaque catégorie)</w:t>
       </w:r>
+    </w:p>
+    <w:p>
+      <w:pPr>
+        <w:numPr>
+          <w:ilvl w:val="1"/>
+          <w:numId w:val="2"/>
+        </w:numPr>
+        <w:spacing w:before="100" w:beforeAutospacing="1" w:after="100" w:afterAutospacing="1" w:line="240" w:lineRule="auto"/>
+        <w:rPr>
+          <w:rFonts w:ascii="Times New Roman" w:eastAsia="Times New Roman" w:hAnsi="Times New Roman" w:cs="Times New Roman"/>
+          <w:kern w:val="0"/>
+          <w:sz w:val="24"/>
+          <w:szCs w:val="24"/>
+          <w:highlight w:val="green"/>
+          <w:lang w:eastAsia="fr-FR"/>
+          <w14:ligatures w14:val="none"/>
+        </w:rPr>
+      </w:pPr>
+      <w:r>
+        <w:rPr>
+          <w:rFonts w:ascii="Times New Roman" w:eastAsia="Times New Roman" w:hAnsi="Times New Roman" w:cs="Times New Roman"/>
+          <w:kern w:val="0"/>
+          <w:sz w:val="24"/>
+          <w:szCs w:val="24"/>
+          <w:highlight w:val="green"/>
+          <w:lang w:eastAsia="fr-FR"/>
+          <w14:ligatures w14:val="none"/>
+        </w:rPr>
+        <w:t xml:space="preserve">Ordinal </w:t>
+      </w:r>
+      <w:proofErr w:type="spellStart"/>
+      <w:r>
+        <w:rPr>
+          <w:rFonts w:ascii="Times New Roman" w:eastAsia="Times New Roman" w:hAnsi="Times New Roman" w:cs="Times New Roman"/>
+          <w:kern w:val="0"/>
+          <w:sz w:val="24"/>
+          <w:szCs w:val="24"/>
+          <w:highlight w:val="green"/>
+          <w:lang w:eastAsia="fr-FR"/>
+          <w14:ligatures w14:val="none"/>
+        </w:rPr>
+        <w:t>Encoding</w:t>
+      </w:r>
+      <w:proofErr w:type="spellEnd"/>
     </w:p>
     <w:p>
       <w:pPr>
@@ -795,6 +854,7 @@
           <w:kern w:val="0"/>
           <w:sz w:val="24"/>
           <w:szCs w:val="24"/>
+          <w:highlight w:val="yellow"/>
           <w:lang w:eastAsia="fr-FR"/>
           <w14:ligatures w14:val="none"/>
         </w:rPr>
@@ -807,6 +867,7 @@
           <w:kern w:val="0"/>
           <w:sz w:val="24"/>
           <w:szCs w:val="24"/>
+          <w:highlight w:val="yellow"/>
           <w:lang w:eastAsia="fr-FR"/>
           <w14:ligatures w14:val="none"/>
         </w:rPr>
@@ -821,6 +882,7 @@
           <w:kern w:val="0"/>
           <w:sz w:val="24"/>
           <w:szCs w:val="24"/>
+          <w:highlight w:val="yellow"/>
           <w:lang w:eastAsia="fr-FR"/>
           <w14:ligatures w14:val="none"/>
         </w:rPr>
@@ -840,6 +902,7 @@
           <w:kern w:val="0"/>
           <w:sz w:val="24"/>
           <w:szCs w:val="24"/>
+          <w:highlight w:val="green"/>
           <w:lang w:eastAsia="fr-FR"/>
           <w14:ligatures w14:val="none"/>
         </w:rPr>
@@ -851,6 +914,7 @@
           <w:kern w:val="0"/>
           <w:sz w:val="24"/>
           <w:szCs w:val="24"/>
+          <w:highlight w:val="green"/>
           <w:lang w:eastAsia="fr-FR"/>
           <w14:ligatures w14:val="none"/>
         </w:rPr>
@@ -863,6 +927,7 @@
           <w:kern w:val="0"/>
           <w:sz w:val="24"/>
           <w:szCs w:val="24"/>
+          <w:highlight w:val="green"/>
           <w:lang w:eastAsia="fr-FR"/>
           <w14:ligatures w14:val="none"/>
         </w:rPr>
@@ -881,16 +946,18 @@
           <w:kern w:val="0"/>
           <w:sz w:val="24"/>
           <w:szCs w:val="24"/>
-          <w:lang w:eastAsia="fr-FR"/>
-          <w14:ligatures w14:val="none"/>
-        </w:rPr>
-      </w:pPr>
-      <w:r>
-        <w:rPr>
-          <w:rFonts w:ascii="Times New Roman" w:eastAsia="Times New Roman" w:hAnsi="Times New Roman" w:cs="Times New Roman"/>
-          <w:kern w:val="0"/>
-          <w:sz w:val="24"/>
-          <w:szCs w:val="24"/>
+          <w:highlight w:val="green"/>
+          <w:lang w:eastAsia="fr-FR"/>
+          <w14:ligatures w14:val="none"/>
+        </w:rPr>
+      </w:pPr>
+      <w:r>
+        <w:rPr>
+          <w:rFonts w:ascii="Times New Roman" w:eastAsia="Times New Roman" w:hAnsi="Times New Roman" w:cs="Times New Roman"/>
+          <w:kern w:val="0"/>
+          <w:sz w:val="24"/>
+          <w:szCs w:val="24"/>
+          <w:highlight w:val="green"/>
           <w:lang w:eastAsia="fr-FR"/>
           <w14:ligatures w14:val="none"/>
         </w:rPr>
@@ -903,6 +970,7 @@
           <w:kern w:val="0"/>
           <w:sz w:val="24"/>
           <w:szCs w:val="24"/>
+          <w:highlight w:val="green"/>
           <w:lang w:eastAsia="fr-FR"/>
           <w14:ligatures w14:val="none"/>
         </w:rPr>
@@ -2112,6 +2180,7 @@
   <w:style w:type="character" w:default="1" w:styleId="Policepardfaut">
     <w:name w:val="Default Paragraph Font"/>
     <w:uiPriority w:val="1"/>
+    <w:semiHidden/>
     <w:unhideWhenUsed/>
   </w:style>
   <w:style w:type="table" w:default="1" w:styleId="TableauNormal">

</xml_diff>

<commit_message>
add scikit learn pipeline
</commit_message>
<xml_diff>
--- a/Day23/liste des exemples de preprocessing.docx
+++ b/Day23/liste des exemples de preprocessing.docx
@@ -770,6 +770,7 @@
           <w:kern w:val="0"/>
           <w:sz w:val="24"/>
           <w:szCs w:val="24"/>
+          <w:highlight w:val="yellow"/>
           <w:lang w:eastAsia="fr-FR"/>
           <w14:ligatures w14:val="none"/>
         </w:rPr>
@@ -782,6 +783,7 @@
           <w:kern w:val="0"/>
           <w:sz w:val="24"/>
           <w:szCs w:val="24"/>
+          <w:highlight w:val="yellow"/>
           <w:lang w:eastAsia="fr-FR"/>
           <w14:ligatures w14:val="none"/>
         </w:rPr>
@@ -797,16 +799,18 @@
         <w:spacing w:before="100" w:beforeAutospacing="1" w:after="100" w:afterAutospacing="1" w:line="240" w:lineRule="auto"/>
         <w:rPr>
           <w:rFonts w:ascii="Times New Roman" w:eastAsia="Times New Roman" w:hAnsi="Times New Roman" w:cs="Times New Roman"/>
-          <w:kern w:val="0"/>
-          <w:sz w:val="24"/>
-          <w:szCs w:val="24"/>
-          <w:lang w:eastAsia="fr-FR"/>
-          <w14:ligatures w14:val="none"/>
-        </w:rPr>
-      </w:pPr>
-      <w:r>
-        <w:rPr>
-          <w:rFonts w:ascii="Times New Roman" w:eastAsia="Times New Roman" w:hAnsi="Times New Roman" w:cs="Times New Roman"/>
+          <w:color w:val="EE0000"/>
+          <w:kern w:val="0"/>
+          <w:sz w:val="24"/>
+          <w:szCs w:val="24"/>
+          <w:lang w:eastAsia="fr-FR"/>
+          <w14:ligatures w14:val="none"/>
+        </w:rPr>
+      </w:pPr>
+      <w:r>
+        <w:rPr>
+          <w:rFonts w:ascii="Times New Roman" w:eastAsia="Times New Roman" w:hAnsi="Times New Roman" w:cs="Times New Roman"/>
+          <w:color w:val="EE0000"/>
           <w:kern w:val="0"/>
           <w:sz w:val="24"/>
           <w:szCs w:val="24"/>
@@ -828,16 +832,18 @@
           <w:kern w:val="0"/>
           <w:sz w:val="24"/>
           <w:szCs w:val="24"/>
-          <w:lang w:eastAsia="fr-FR"/>
-          <w14:ligatures w14:val="none"/>
-        </w:rPr>
-      </w:pPr>
-      <w:r>
-        <w:rPr>
-          <w:rFonts w:ascii="Times New Roman" w:eastAsia="Times New Roman" w:hAnsi="Times New Roman" w:cs="Times New Roman"/>
-          <w:kern w:val="0"/>
-          <w:sz w:val="24"/>
-          <w:szCs w:val="24"/>
+          <w:highlight w:val="green"/>
+          <w:lang w:eastAsia="fr-FR"/>
+          <w14:ligatures w14:val="none"/>
+        </w:rPr>
+      </w:pPr>
+      <w:r>
+        <w:rPr>
+          <w:rFonts w:ascii="Times New Roman" w:eastAsia="Times New Roman" w:hAnsi="Times New Roman" w:cs="Times New Roman"/>
+          <w:kern w:val="0"/>
+          <w:sz w:val="24"/>
+          <w:szCs w:val="24"/>
+          <w:highlight w:val="green"/>
           <w:lang w:eastAsia="fr-FR"/>
           <w14:ligatures w14:val="none"/>
         </w:rPr>
@@ -850,6 +856,7 @@
           <w:kern w:val="0"/>
           <w:sz w:val="24"/>
           <w:szCs w:val="24"/>
+          <w:highlight w:val="green"/>
           <w:lang w:eastAsia="fr-FR"/>
           <w14:ligatures w14:val="none"/>
         </w:rPr>
@@ -862,6 +869,7 @@
           <w:kern w:val="0"/>
           <w:sz w:val="24"/>
           <w:szCs w:val="24"/>
+          <w:highlight w:val="green"/>
           <w:lang w:eastAsia="fr-FR"/>
           <w14:ligatures w14:val="none"/>
         </w:rPr>
@@ -1016,6 +1024,7 @@
           <w:kern w:val="0"/>
           <w:sz w:val="24"/>
           <w:szCs w:val="24"/>
+          <w:highlight w:val="yellow"/>
           <w:lang w:eastAsia="fr-FR"/>
           <w14:ligatures w14:val="none"/>
         </w:rPr>
@@ -1028,10 +1037,41 @@
           <w:kern w:val="0"/>
           <w:sz w:val="24"/>
           <w:szCs w:val="24"/>
-          <w:lang w:eastAsia="fr-FR"/>
-          <w14:ligatures w14:val="none"/>
-        </w:rPr>
-        <w:t>Transformation des distributions</w:t>
+          <w:highlight w:val="yellow"/>
+          <w:lang w:eastAsia="fr-FR"/>
+          <w14:ligatures w14:val="none"/>
+        </w:rPr>
+        <w:t xml:space="preserve">Pipeline </w:t>
+      </w:r>
+      <w:proofErr w:type="spellStart"/>
+      <w:r>
+        <w:rPr>
+          <w:rFonts w:ascii="Times New Roman" w:eastAsia="Times New Roman" w:hAnsi="Times New Roman" w:cs="Times New Roman"/>
+          <w:b/>
+          <w:bCs/>
+          <w:kern w:val="0"/>
+          <w:sz w:val="24"/>
+          <w:szCs w:val="24"/>
+          <w:highlight w:val="yellow"/>
+          <w:lang w:eastAsia="fr-FR"/>
+          <w14:ligatures w14:val="none"/>
+        </w:rPr>
+        <w:t>Scikit</w:t>
+      </w:r>
+      <w:proofErr w:type="spellEnd"/>
+      <w:r>
+        <w:rPr>
+          <w:rFonts w:ascii="Times New Roman" w:eastAsia="Times New Roman" w:hAnsi="Times New Roman" w:cs="Times New Roman"/>
+          <w:b/>
+          <w:bCs/>
+          <w:kern w:val="0"/>
+          <w:sz w:val="24"/>
+          <w:szCs w:val="24"/>
+          <w:highlight w:val="yellow"/>
+          <w:lang w:eastAsia="fr-FR"/>
+          <w14:ligatures w14:val="none"/>
+        </w:rPr>
+        <w:t>-learn</w:t>
       </w:r>
     </w:p>
     <w:p>
@@ -1046,168 +1086,7 @@
           <w:kern w:val="0"/>
           <w:sz w:val="24"/>
           <w:szCs w:val="24"/>
-          <w:lang w:eastAsia="fr-FR"/>
-          <w14:ligatures w14:val="none"/>
-        </w:rPr>
-      </w:pPr>
-      <w:r>
-        <w:rPr>
-          <w:rFonts w:ascii="Times New Roman" w:eastAsia="Times New Roman" w:hAnsi="Times New Roman" w:cs="Times New Roman"/>
-          <w:kern w:val="0"/>
-          <w:sz w:val="24"/>
-          <w:szCs w:val="24"/>
-          <w:lang w:eastAsia="fr-FR"/>
-          <w14:ligatures w14:val="none"/>
-        </w:rPr>
-        <w:t>Log-</w:t>
-      </w:r>
-      <w:proofErr w:type="spellStart"/>
-      <w:r>
-        <w:rPr>
-          <w:rFonts w:ascii="Times New Roman" w:eastAsia="Times New Roman" w:hAnsi="Times New Roman" w:cs="Times New Roman"/>
-          <w:kern w:val="0"/>
-          <w:sz w:val="24"/>
-          <w:szCs w:val="24"/>
-          <w:lang w:eastAsia="fr-FR"/>
-          <w14:ligatures w14:val="none"/>
-        </w:rPr>
-        <w:t>transform</w:t>
-      </w:r>
-      <w:proofErr w:type="spellEnd"/>
-      <w:r>
-        <w:rPr>
-          <w:rFonts w:ascii="Times New Roman" w:eastAsia="Times New Roman" w:hAnsi="Times New Roman" w:cs="Times New Roman"/>
-          <w:kern w:val="0"/>
-          <w:sz w:val="24"/>
-          <w:szCs w:val="24"/>
-          <w:lang w:eastAsia="fr-FR"/>
-          <w14:ligatures w14:val="none"/>
-        </w:rPr>
-        <w:t xml:space="preserve"> (pour données très </w:t>
-      </w:r>
-      <w:proofErr w:type="spellStart"/>
-      <w:r>
-        <w:rPr>
-          <w:rFonts w:ascii="Times New Roman" w:eastAsia="Times New Roman" w:hAnsi="Times New Roman" w:cs="Times New Roman"/>
-          <w:kern w:val="0"/>
-          <w:sz w:val="24"/>
-          <w:szCs w:val="24"/>
-          <w:lang w:eastAsia="fr-FR"/>
-          <w14:ligatures w14:val="none"/>
-        </w:rPr>
-        <w:t>skewed</w:t>
-      </w:r>
-      <w:proofErr w:type="spellEnd"/>
-      <w:r>
-        <w:rPr>
-          <w:rFonts w:ascii="Times New Roman" w:eastAsia="Times New Roman" w:hAnsi="Times New Roman" w:cs="Times New Roman"/>
-          <w:kern w:val="0"/>
-          <w:sz w:val="24"/>
-          <w:szCs w:val="24"/>
-          <w:lang w:eastAsia="fr-FR"/>
-          <w14:ligatures w14:val="none"/>
-        </w:rPr>
-        <w:t>)</w:t>
-      </w:r>
-    </w:p>
-    <w:p>
-      <w:pPr>
-        <w:numPr>
-          <w:ilvl w:val="1"/>
-          <w:numId w:val="2"/>
-        </w:numPr>
-        <w:spacing w:before="100" w:beforeAutospacing="1" w:after="100" w:afterAutospacing="1" w:line="240" w:lineRule="auto"/>
-        <w:rPr>
-          <w:rFonts w:ascii="Times New Roman" w:eastAsia="Times New Roman" w:hAnsi="Times New Roman" w:cs="Times New Roman"/>
-          <w:kern w:val="0"/>
-          <w:sz w:val="24"/>
-          <w:szCs w:val="24"/>
-          <w:lang w:eastAsia="fr-FR"/>
-          <w14:ligatures w14:val="none"/>
-        </w:rPr>
-      </w:pPr>
-      <w:r>
-        <w:rPr>
-          <w:rFonts w:ascii="Times New Roman" w:eastAsia="Times New Roman" w:hAnsi="Times New Roman" w:cs="Times New Roman"/>
-          <w:kern w:val="0"/>
-          <w:sz w:val="24"/>
-          <w:szCs w:val="24"/>
-          <w:lang w:eastAsia="fr-FR"/>
-          <w14:ligatures w14:val="none"/>
-        </w:rPr>
-        <w:t>Box-Cox, Yeo-Johnson</w:t>
-      </w:r>
-    </w:p>
-    <w:p>
-      <w:pPr>
-        <w:numPr>
-          <w:ilvl w:val="0"/>
-          <w:numId w:val="2"/>
-        </w:numPr>
-        <w:spacing w:before="100" w:beforeAutospacing="1" w:after="100" w:afterAutospacing="1" w:line="240" w:lineRule="auto"/>
-        <w:rPr>
-          <w:rFonts w:ascii="Times New Roman" w:eastAsia="Times New Roman" w:hAnsi="Times New Roman" w:cs="Times New Roman"/>
-          <w:kern w:val="0"/>
-          <w:sz w:val="24"/>
-          <w:szCs w:val="24"/>
-          <w:lang w:eastAsia="fr-FR"/>
-          <w14:ligatures w14:val="none"/>
-        </w:rPr>
-      </w:pPr>
-      <w:r>
-        <w:rPr>
-          <w:rFonts w:ascii="Times New Roman" w:eastAsia="Times New Roman" w:hAnsi="Times New Roman" w:cs="Times New Roman"/>
-          <w:b/>
-          <w:bCs/>
-          <w:kern w:val="0"/>
-          <w:sz w:val="24"/>
-          <w:szCs w:val="24"/>
-          <w:lang w:eastAsia="fr-FR"/>
-          <w14:ligatures w14:val="none"/>
-        </w:rPr>
-        <w:t xml:space="preserve">Pipeline </w:t>
-      </w:r>
-      <w:proofErr w:type="spellStart"/>
-      <w:r>
-        <w:rPr>
-          <w:rFonts w:ascii="Times New Roman" w:eastAsia="Times New Roman" w:hAnsi="Times New Roman" w:cs="Times New Roman"/>
-          <w:b/>
-          <w:bCs/>
-          <w:kern w:val="0"/>
-          <w:sz w:val="24"/>
-          <w:szCs w:val="24"/>
-          <w:lang w:eastAsia="fr-FR"/>
-          <w14:ligatures w14:val="none"/>
-        </w:rPr>
-        <w:t>Scikit</w:t>
-      </w:r>
-      <w:proofErr w:type="spellEnd"/>
-      <w:r>
-        <w:rPr>
-          <w:rFonts w:ascii="Times New Roman" w:eastAsia="Times New Roman" w:hAnsi="Times New Roman" w:cs="Times New Roman"/>
-          <w:b/>
-          <w:bCs/>
-          <w:kern w:val="0"/>
-          <w:sz w:val="24"/>
-          <w:szCs w:val="24"/>
-          <w:lang w:eastAsia="fr-FR"/>
-          <w14:ligatures w14:val="none"/>
-        </w:rPr>
-        <w:t>-learn</w:t>
-      </w:r>
-    </w:p>
-    <w:p>
-      <w:pPr>
-        <w:numPr>
-          <w:ilvl w:val="1"/>
-          <w:numId w:val="2"/>
-        </w:numPr>
-        <w:spacing w:before="100" w:beforeAutospacing="1" w:after="100" w:afterAutospacing="1" w:line="240" w:lineRule="auto"/>
-        <w:rPr>
-          <w:rFonts w:ascii="Times New Roman" w:eastAsia="Times New Roman" w:hAnsi="Times New Roman" w:cs="Times New Roman"/>
-          <w:kern w:val="0"/>
-          <w:sz w:val="24"/>
-          <w:szCs w:val="24"/>
+          <w:highlight w:val="green"/>
           <w:lang w:eastAsia="fr-FR"/>
           <w14:ligatures w14:val="none"/>
         </w:rPr>
@@ -1218,6 +1097,7 @@
           <w:kern w:val="0"/>
           <w:sz w:val="20"/>
           <w:szCs w:val="20"/>
+          <w:highlight w:val="green"/>
           <w:lang w:eastAsia="fr-FR"/>
           <w14:ligatures w14:val="none"/>
         </w:rPr>
@@ -1229,6 +1109,7 @@
           <w:kern w:val="0"/>
           <w:sz w:val="24"/>
           <w:szCs w:val="24"/>
+          <w:highlight w:val="green"/>
           <w:lang w:eastAsia="fr-FR"/>
           <w14:ligatures w14:val="none"/>
         </w:rPr>
@@ -1241,6 +1122,7 @@
           <w:kern w:val="0"/>
           <w:sz w:val="20"/>
           <w:szCs w:val="20"/>
+          <w:highlight w:val="green"/>
           <w:lang w:eastAsia="fr-FR"/>
           <w14:ligatures w14:val="none"/>
         </w:rPr>
@@ -1253,6 +1135,7 @@
           <w:kern w:val="0"/>
           <w:sz w:val="24"/>
           <w:szCs w:val="24"/>
+          <w:highlight w:val="green"/>
           <w:lang w:eastAsia="fr-FR"/>
           <w14:ligatures w14:val="none"/>
         </w:rPr>
@@ -1265,6 +1148,7 @@
           <w:kern w:val="0"/>
           <w:sz w:val="24"/>
           <w:szCs w:val="24"/>
+          <w:highlight w:val="green"/>
           <w:lang w:eastAsia="fr-FR"/>
           <w14:ligatures w14:val="none"/>
         </w:rPr>
@@ -1277,6 +1161,7 @@
           <w:kern w:val="0"/>
           <w:sz w:val="24"/>
           <w:szCs w:val="24"/>
+          <w:highlight w:val="green"/>
           <w:lang w:eastAsia="fr-FR"/>
           <w14:ligatures w14:val="none"/>
         </w:rPr>

</xml_diff>